<commit_message>
Modelo de datos de usuario y unit tests completados
</commit_message>
<xml_diff>
--- a/DOCS/Explicaciones sobre tecnología.docx
+++ b/DOCS/Explicaciones sobre tecnología.docx
@@ -342,7 +342,7 @@
           <w:noProof/>
           <w:lang w:eastAsia="es-ES_tradnl"/>
         </w:rPr>
-        <w:pict w14:anchorId="38145BD9">
+        <w:pict w14:anchorId="18BA73C4">
           <v:rect id="_x0000_i1026" alt="" style="width:425.2pt;height:.05pt;mso-width-percent:0;mso-height-percent:0;mso-width-percent:0;mso-height-percent:0" o:hralign="center" o:hrstd="t" o:hr="t" fillcolor="#a0a0a0" stroked="f"/>
         </w:pict>
       </w:r>
@@ -639,7 +639,7 @@
           <w:noProof/>
           <w:lang w:eastAsia="es-ES_tradnl"/>
         </w:rPr>
-        <w:pict w14:anchorId="3CDB75BF">
+        <w:pict w14:anchorId="72040D2A">
           <v:rect id="_x0000_i1025" alt="" style="width:425.2pt;height:.05pt;mso-width-percent:0;mso-height-percent:0;mso-width-percent:0;mso-height-percent:0" o:hralign="center" o:hrstd="t" o:hr="t" fillcolor="#a0a0a0" stroked="f"/>
         </w:pict>
       </w:r>
@@ -821,65 +821,14 @@
     <w:p/>
     <w:p>
       <w:r>
-        <w:t>Para una aplicación móvil, no hace falta tener un endpoint get(/) para mostrar el HTML o la página, dado que la aplicación web ya tiene internamente cargado el frontend, solamente se llama al servidor para hacer peticiones de tipo API.</w:t>
-      </w:r>
-    </w:p>
-    <w:p/>
-    <w:p/>
-    <w:p>
-      <w:r>
-        <w:t>JWT vs sesión_id:</w:t>
-      </w:r>
-    </w:p>
-    <w:p/>
-    <w:p>
-      <w:r>
-        <w:drawing>
-          <wp:inline distT="0" distB="0" distL="0" distR="0" wp14:anchorId="6C7A1DE0" wp14:editId="3776F17D">
-            <wp:extent cx="5400040" cy="3117850"/>
-            <wp:effectExtent l="0" t="0" r="0" b="6350"/>
-            <wp:docPr id="1777904058" name="Imagen 1" descr="Interfaz de usuario gráfica, Texto, Aplicación&#10;&#10;El contenido generado por IA puede ser incorrecto."/>
-            <wp:cNvGraphicFramePr>
-              <a:graphicFrameLocks xmlns:a="http://schemas.openxmlformats.org/drawingml/2006/main" noChangeAspect="1"/>
-            </wp:cNvGraphicFramePr>
-            <a:graphic xmlns:a="http://schemas.openxmlformats.org/drawingml/2006/main">
-              <a:graphicData uri="http://schemas.openxmlformats.org/drawingml/2006/picture">
-                <pic:pic xmlns:pic="http://schemas.openxmlformats.org/drawingml/2006/picture">
-                  <pic:nvPicPr>
-                    <pic:cNvPr id="1777904058" name="Imagen 1" descr="Interfaz de usuario gráfica, Texto, Aplicación&#10;&#10;El contenido generado por IA puede ser incorrecto."/>
-                    <pic:cNvPicPr/>
-                  </pic:nvPicPr>
-                  <pic:blipFill>
-                    <a:blip r:embed="rId5"/>
-                    <a:stretch>
-                      <a:fillRect/>
-                    </a:stretch>
-                  </pic:blipFill>
-                  <pic:spPr>
-                    <a:xfrm>
-                      <a:off x="0" y="0"/>
-                      <a:ext cx="5400040" cy="3117850"/>
-                    </a:xfrm>
-                    <a:prstGeom prst="rect">
-                      <a:avLst/>
-                    </a:prstGeom>
-                  </pic:spPr>
-                </pic:pic>
-              </a:graphicData>
-            </a:graphic>
-          </wp:inline>
-        </w:drawing>
-      </w:r>
-    </w:p>
-    <w:p/>
-    <w:p/>
-    <w:p>
-      <w:r>
         <w:t>Errores en peticiones HTTP de signup:</w:t>
       </w:r>
     </w:p>
     <w:p>
       <w:r>
+        <w:rPr>
+          <w:noProof/>
+        </w:rPr>
         <w:drawing>
           <wp:inline distT="0" distB="0" distL="0" distR="0" wp14:anchorId="70F0F511" wp14:editId="10BECAF9">
             <wp:extent cx="5400040" cy="771525"/>
@@ -896,7 +845,7 @@
                     <pic:cNvPicPr/>
                   </pic:nvPicPr>
                   <pic:blipFill>
-                    <a:blip r:embed="rId6"/>
+                    <a:blip r:embed="rId5"/>
                     <a:stretch>
                       <a:fillRect/>
                     </a:stretch>
@@ -919,11 +868,14 @@
     </w:p>
     <w:p/>
     <w:p/>
-    <w:p>
-      <w:r>
-        <w:t>Se esta usando Client Session patron para el JWT.</w:t>
-      </w:r>
-    </w:p>
+    <w:p/>
+    <w:p>
+      <w:r>
+        <w:t>Utilizar modulo de backend de Argon2 o cualquier librería mejor que hashear la contraseña en la BBDD, porque así no viaja en claro por la comunicación entre servidor y cliente (Se usa HTTP de momento).</w:t>
+      </w:r>
+    </w:p>
+    <w:p/>
+    <w:p/>
     <w:sectPr>
       <w:pgSz w:w="11906" w:h="16838"/>
       <w:pgMar w:top="1417" w:right="1701" w:bottom="1417" w:left="1701" w:header="708" w:footer="708" w:gutter="0"/>

</xml_diff>

<commit_message>
First approach to schema database creation
</commit_message>
<xml_diff>
--- a/DOCS/Explicaciones sobre tecnología.docx
+++ b/DOCS/Explicaciones sobre tecnología.docx
@@ -342,7 +342,7 @@
           <w:noProof/>
           <w:lang w:eastAsia="es-ES_tradnl"/>
         </w:rPr>
-        <w:pict w14:anchorId="18BA73C4">
+        <w:pict w14:anchorId="31A30095">
           <v:rect id="_x0000_i1026" alt="" style="width:425.2pt;height:.05pt;mso-width-percent:0;mso-height-percent:0;mso-width-percent:0;mso-height-percent:0" o:hralign="center" o:hrstd="t" o:hr="t" fillcolor="#a0a0a0" stroked="f"/>
         </w:pict>
       </w:r>
@@ -639,7 +639,7 @@
           <w:noProof/>
           <w:lang w:eastAsia="es-ES_tradnl"/>
         </w:rPr>
-        <w:pict w14:anchorId="72040D2A">
+        <w:pict w14:anchorId="19FEE8B2">
           <v:rect id="_x0000_i1025" alt="" style="width:425.2pt;height:.05pt;mso-width-percent:0;mso-height-percent:0;mso-width-percent:0;mso-height-percent:0" o:hralign="center" o:hrstd="t" o:hr="t" fillcolor="#a0a0a0" stroked="f"/>
         </w:pict>
       </w:r>
@@ -875,7 +875,92 @@
       </w:r>
     </w:p>
     <w:p/>
+    <w:p>
+      <w:pPr>
+        <w:shd w:val="clear" w:color="auto" w:fill="052529"/>
+        <w:spacing w:line="315" w:lineRule="atLeast"/>
+        <w:rPr>
+          <w:rFonts w:ascii="Fira Code" w:eastAsia="Times New Roman" w:hAnsi="Fira Code" w:cs="Fira Code"/>
+          <w:b/>
+          <w:bCs/>
+          <w:color w:val="B2CACD"/>
+          <w:sz w:val="21"/>
+          <w:szCs w:val="21"/>
+          <w:lang w:eastAsia="es-ES_tradnl"/>
+        </w:rPr>
+      </w:pPr>
+      <w:r>
+        <w:rPr>
+          <w:rFonts w:ascii="Fira Code" w:eastAsia="Times New Roman" w:hAnsi="Fira Code" w:cs="Fira Code"/>
+          <w:b/>
+          <w:bCs/>
+          <w:color w:val="49E9A6"/>
+          <w:sz w:val="21"/>
+          <w:szCs w:val="21"/>
+          <w:lang w:eastAsia="es-ES_tradnl"/>
+        </w:rPr>
+        <w:t xml:space="preserve">Argon2 is the winner of the Password Hashing Competition and is </w:t>
+      </w:r>
+    </w:p>
+    <w:p>
+      <w:pPr>
+        <w:shd w:val="clear" w:color="auto" w:fill="052529"/>
+        <w:spacing w:line="315" w:lineRule="atLeast"/>
+        <w:rPr>
+          <w:rFonts w:ascii="Fira Code" w:eastAsia="Times New Roman" w:hAnsi="Fira Code" w:cs="Fira Code"/>
+          <w:b/>
+          <w:bCs/>
+          <w:color w:val="B2CACD"/>
+          <w:sz w:val="21"/>
+          <w:szCs w:val="21"/>
+          <w:lang w:eastAsia="es-ES_tradnl"/>
+        </w:rPr>
+      </w:pPr>
+      <w:r>
+        <w:rPr>
+          <w:rFonts w:ascii="Fira Code" w:eastAsia="Times New Roman" w:hAnsi="Fira Code" w:cs="Fira Code"/>
+          <w:b/>
+          <w:bCs/>
+          <w:color w:val="49E9A6"/>
+          <w:sz w:val="21"/>
+          <w:szCs w:val="21"/>
+          <w:lang w:eastAsia="es-ES_tradnl"/>
+        </w:rPr>
+        <w:t>recommended for password storage.</w:t>
+      </w:r>
+    </w:p>
     <w:p/>
+    <w:p/>
+    <w:p>
+      <w:r>
+        <w:t xml:space="preserve">BASE DE DATOS: </w:t>
+      </w:r>
+    </w:p>
+    <w:p/>
+    <w:p>
+      <w:r>
+        <w:t>created_at: se genera en base de datos para que no tengamos problemas de tipos en Python y porque el tiempo que tarda en generarse la consulta y llegar al servidor modifica la fecha real y puede salir diferente al default de la bbdd.</w:t>
+      </w:r>
+    </w:p>
+    <w:p/>
+    <w:p>
+      <w:r>
+        <w:t>provider: columna de la entidad auth_identities que identifica los métodos de autenticación que puede haber en un futuro. EJ: “password”, “google”, “facebook”… Es obligatorio saber siempre con qué método se ha registrado.</w:t>
+      </w:r>
+    </w:p>
+    <w:p/>
+    <w:p>
+      <w:r>
+        <w:t>provider_user_id: columna de la entidad auth_identities que identifica el usuario por parte de las entidades de terceros que manejan el registro. Es decir, solo tendrá un valor si se ha registrado a través de entidades externas, es decir, provider ¡= “password”.</w:t>
+      </w:r>
+    </w:p>
+    <w:p/>
+    <w:p>
+      <w:r>
+        <w:lastRenderedPageBreak/>
+        <w:t>CC y números de teléfono: se separa en dos campos de tipo número para que no hay problemas de formato. Se encarga la aplicación de transformar el número de teléfono en dos campos distintos numéricos</w:t>
+      </w:r>
+    </w:p>
     <w:sectPr>
       <w:pgSz w:w="11906" w:h="16838"/>
       <w:pgMar w:top="1417" w:right="1701" w:bottom="1417" w:left="1701" w:header="708" w:footer="708" w:gutter="0"/>

</xml_diff>

<commit_message>
Refactor of hash and uuid module. Now below backend/utils folder
</commit_message>
<xml_diff>
--- a/DOCS/Explicaciones sobre tecnología.docx
+++ b/DOCS/Explicaciones sobre tecnología.docx
@@ -342,7 +342,7 @@
           <w:noProof/>
           <w:lang w:eastAsia="es-ES_tradnl"/>
         </w:rPr>
-        <w:pict w14:anchorId="4D53701E">
+        <w:pict w14:anchorId="57EE0D39">
           <v:rect id="_x0000_i1026" alt="" style="width:425.2pt;height:.05pt;mso-width-percent:0;mso-height-percent:0;mso-width-percent:0;mso-height-percent:0" o:hralign="center" o:hrstd="t" o:hr="t" fillcolor="#a0a0a0" stroked="f"/>
         </w:pict>
       </w:r>
@@ -639,7 +639,7 @@
           <w:noProof/>
           <w:lang w:eastAsia="es-ES_tradnl"/>
         </w:rPr>
-        <w:pict w14:anchorId="2617DD46">
+        <w:pict w14:anchorId="23F3D43D">
           <v:rect id="_x0000_i1025" alt="" style="width:425.2pt;height:.05pt;mso-width-percent:0;mso-height-percent:0;mso-width-percent:0;mso-height-percent:0" o:hralign="center" o:hrstd="t" o:hr="t" fillcolor="#a0a0a0" stroked="f"/>
         </w:pict>
       </w:r>
@@ -1086,6 +1086,31 @@
           <w:lang w:eastAsia="es-ES_tradnl"/>
         </w:rPr>
         <w:t>.</w:t>
+      </w:r>
+    </w:p>
+    <w:p>
+      <w:pPr>
+        <w:spacing w:before="100" w:beforeAutospacing="1" w:after="100" w:afterAutospacing="1"/>
+        <w:rPr>
+          <w:rFonts w:ascii="Times New Roman" w:eastAsia="Times New Roman" w:hAnsi="Times New Roman" w:cs="Times New Roman"/>
+          <w:lang w:eastAsia="es-ES_tradnl"/>
+        </w:rPr>
+      </w:pPr>
+    </w:p>
+    <w:p>
+      <w:pPr>
+        <w:spacing w:before="100" w:beforeAutospacing="1" w:after="100" w:afterAutospacing="1"/>
+        <w:rPr>
+          <w:rFonts w:ascii="Times New Roman" w:eastAsia="Times New Roman" w:hAnsi="Times New Roman" w:cs="Times New Roman"/>
+          <w:lang w:eastAsia="es-ES_tradnl"/>
+        </w:rPr>
+      </w:pPr>
+      <w:r>
+        <w:rPr>
+          <w:rFonts w:ascii="Times New Roman" w:eastAsia="Times New Roman" w:hAnsi="Times New Roman" w:cs="Times New Roman"/>
+          <w:lang w:eastAsia="es-ES_tradnl"/>
+        </w:rPr>
+        <w:t>Sesiones para. Usuario y login con tabla sessions</w:t>
       </w:r>
     </w:p>
     <w:p/>

</xml_diff>